<commit_message>
Remove highlighting from the precedent templates
The firm's precedents mark review points with Word highlighting, which was
carried into every generated document. Only the highlight tags are removed;
each template's wording is unchanged (checked text-for-text).

Co-Authored-By: Claude Opus 5.5 <noreply@anthropic.com>
</commit_message>
<xml_diff>
--- a/api/templates/Additional powers to be included in power of attorney form - Client 1 (Clio).docx
+++ b/api/templates/Additional powers to be included in power of attorney form - Client 1 (Clio).docx
@@ -186,7 +186,6 @@
             <w:r>
               <w:rPr>
                 <w:noProof w:val="0"/>
-                <w:highlight w:val="yellow"/>
               </w:rPr>
               <w:t>[#review if appropriate for client circumstance]</w:t>
             </w:r>
@@ -216,9 +215,7 @@
               </w:rPr>
             </w:pPr>
             <w:r>
-              <w:rPr>
-                <w:highlight w:val="cyan"/>
-              </w:rPr>
+              <w:rPr/>
               <w:t>[#couple]</w:t>
             </w:r>
             <w:r>
@@ -227,21 +224,18 @@
             <w:r>
               <w:rPr>
                 <w:rFonts w:asciiTheme="minorHAnsi" w:hAnsiTheme="minorHAnsi" w:cstheme="minorHAnsi"/>
-                <w:highlight w:val="yellow"/>
               </w:rPr>
               <w:t>[#review if appropriate for client circumsta</w:t>
             </w:r>
             <w:r>
               <w:rPr>
                 <w:rFonts w:asciiTheme="minorHAnsi" w:hAnsiTheme="minorHAnsi" w:cstheme="minorHAnsi"/>
-                <w:highlight w:val="yellow"/>
               </w:rPr>
               <w:t>n</w:t>
             </w:r>
             <w:r>
               <w:rPr>
                 <w:rFonts w:asciiTheme="minorHAnsi" w:hAnsiTheme="minorHAnsi" w:cstheme="minorHAnsi"/>
-                <w:highlight w:val="yellow"/>
               </w:rPr>
               <w:t>ce]</w:t>
             </w:r>
@@ -258,9 +252,7 @@
               <w:t xml:space="preserve">I authorise my attorney to confer benefits on </w:t>
             </w:r>
             <w:r>
-              <w:rPr>
-                <w:highlight w:val="green"/>
-              </w:rPr>
+              <w:rPr/>
               <w:t>&lt;&lt; Matter.Relationships.Mrs.Name &gt;&gt;</w:t>
             </w:r>
             <w:r>
@@ -281,7 +273,6 @@
               <w:rPr>
                 <w:rFonts w:asciiTheme="minorHAnsi" w:hAnsiTheme="minorHAnsi" w:cstheme="minorHAnsi"/>
                 <w:i/>
-                <w:highlight w:val="yellow"/>
               </w:rPr>
               <w:t>Powers of Attorney Act</w:t>
             </w:r>
@@ -289,7 +280,6 @@
               <w:rPr>
                 <w:rFonts w:asciiTheme="minorHAnsi" w:hAnsiTheme="minorHAnsi" w:cstheme="minorHAnsi"/>
                 <w:i/>
-                <w:highlight w:val="yellow"/>
               </w:rPr>
               <w:t xml:space="preserve"> [#insert appropriate jurisdiction citation</w:t>
             </w:r>
@@ -307,9 +297,7 @@
               <w:t xml:space="preserve">, and in addition to those rights, use my sole property and any share of any jointly owned property for any purpose that is necessary to provide for the welfare, benefit or advancement in life of me, </w:t>
             </w:r>
             <w:r>
-              <w:rPr>
-                <w:highlight w:val="green"/>
-              </w:rPr>
+              <w:rPr/>
               <w:t>&lt;&lt; Matter.Relationships.Mrs.Name &gt;&gt;</w:t>
             </w:r>
             <w:r>
@@ -349,21 +337,18 @@
             <w:r>
               <w:rPr>
                 <w:rFonts w:asciiTheme="minorHAnsi" w:hAnsiTheme="minorHAnsi" w:cstheme="minorHAnsi"/>
-                <w:highlight w:val="yellow"/>
               </w:rPr>
               <w:t>[#review if appropriate for client circumsta</w:t>
             </w:r>
             <w:r>
               <w:rPr>
                 <w:rFonts w:asciiTheme="minorHAnsi" w:hAnsiTheme="minorHAnsi" w:cstheme="minorHAnsi"/>
-                <w:highlight w:val="yellow"/>
               </w:rPr>
               <w:t>n</w:t>
             </w:r>
             <w:r>
               <w:rPr>
                 <w:rFonts w:asciiTheme="minorHAnsi" w:hAnsiTheme="minorHAnsi" w:cstheme="minorHAnsi"/>
-                <w:highlight w:val="yellow"/>
               </w:rPr>
               <w:t>ce]</w:t>
             </w:r>

</xml_diff>